<commit_message>
ADD: presentation and rpz
</commit_message>
<xml_diff>
--- a/master/Diploma/docx/OnyushevA_RK6-41M_Diploma.docx
+++ b/master/Diploma/docx/OnyushevA_RK6-41M_Diploma.docx
@@ -4630,20 +4630,7 @@
                 <w:u w:val="single"/>
                 <w:lang w:val="ru-RU"/>
               </w:rPr>
-              <w:t xml:space="preserve"> </w:t>
-            </w:r>
-            <w:r>
-              <w:rPr>
-                <w:rFonts w:eastAsia="Times New Roman" w:cs="Times New Roman"/>
-                <w:i/>
-                <w:iCs/>
-                <w:color w:val="000000" w:themeColor="text1"/>
-                <w:sz w:val="24"/>
-                <w:szCs w:val="24"/>
-                <w:u w:val="single"/>
-                <w:lang w:val="ru-RU"/>
-              </w:rPr>
-              <w:t>механизмы обмена сообщениями и отправки уведомлений</w:t>
+              <w:t xml:space="preserve"> механизмы обмена сообщениями и отправки уведомлений</w:t>
             </w:r>
             <w:r>
               <w:rPr>
@@ -10619,6 +10606,7 @@
       <w:bookmarkStart w:id="7" w:name="_Toc200354878"/>
       <w:bookmarkStart w:id="8" w:name="_Toc200354912"/>
       <w:bookmarkStart w:id="9" w:name="_Toc200356936"/>
+      <w:bookmarkStart w:id="10" w:name="_Toc227887510"/>
       <w:r>
         <w:lastRenderedPageBreak/>
         <w:t>АННОТАЦИЯ</w:t>
@@ -10627,6 +10615,7 @@
       <w:bookmarkEnd w:id="7"/>
       <w:bookmarkEnd w:id="8"/>
       <w:bookmarkEnd w:id="9"/>
+      <w:bookmarkEnd w:id="10"/>
     </w:p>
     <w:p>
       <w:pPr>
@@ -10750,24 +10739,26 @@
           <w:docGrid w:linePitch="381"/>
         </w:sectPr>
       </w:pPr>
-      <w:bookmarkStart w:id="10" w:name="_Toc192611280"/>
+      <w:bookmarkStart w:id="11" w:name="_Toc192611280"/>
     </w:p>
     <w:p>
       <w:pPr>
         <w:pStyle w:val="HeaderDefault"/>
         <w:spacing w:line="360" w:lineRule="auto"/>
       </w:pPr>
-      <w:bookmarkStart w:id="11" w:name="_Toc200354879"/>
-      <w:bookmarkStart w:id="12" w:name="_Toc200354913"/>
-      <w:bookmarkStart w:id="13" w:name="_Toc200356937"/>
+      <w:bookmarkStart w:id="12" w:name="_Toc200354879"/>
+      <w:bookmarkStart w:id="13" w:name="_Toc200354913"/>
+      <w:bookmarkStart w:id="14" w:name="_Toc200356937"/>
+      <w:bookmarkStart w:id="15" w:name="_Toc227887511"/>
       <w:r>
         <w:lastRenderedPageBreak/>
         <w:t>ОСНОВНЫЕ ПОНЯТИЯ И ОПРЕДЕЛЕНИЯ</w:t>
       </w:r>
-      <w:bookmarkEnd w:id="10"/>
       <w:bookmarkEnd w:id="11"/>
       <w:bookmarkEnd w:id="12"/>
       <w:bookmarkEnd w:id="13"/>
+      <w:bookmarkEnd w:id="14"/>
+      <w:bookmarkEnd w:id="15"/>
     </w:p>
     <w:p>
       <w:pPr>
@@ -11177,23 +11168,67 @@
       <w:pPr>
         <w:spacing w:after="0" w:line="360" w:lineRule="auto"/>
         <w:jc w:val="both"/>
+        <w:rPr>
+          <w:lang w:val="ru-RU"/>
+        </w:rPr>
       </w:pPr>
       <w:r>
         <w:rPr>
           <w:rStyle w:val="ac"/>
         </w:rPr>
-        <w:t>JWT (JSON Web Token)</w:t>
-      </w:r>
-      <w:r>
-        <w:t xml:space="preserve"> — </w:t>
-      </w:r>
-      <w:proofErr w:type="spellStart"/>
-      <w:r>
-        <w:t>компактный</w:t>
-      </w:r>
-      <w:proofErr w:type="spellEnd"/>
-      <w:r>
-        <w:t xml:space="preserve"> формат токена, используемый для безопасной передачи данных о пользователе и его правах.</w:t>
+        <w:t>JWT</w:t>
+      </w:r>
+      <w:r>
+        <w:rPr>
+          <w:rStyle w:val="ac"/>
+          <w:lang w:val="ru-RU"/>
+        </w:rPr>
+        <w:t xml:space="preserve"> (</w:t>
+      </w:r>
+      <w:r>
+        <w:rPr>
+          <w:rStyle w:val="ac"/>
+        </w:rPr>
+        <w:t>JSON</w:t>
+      </w:r>
+      <w:r>
+        <w:rPr>
+          <w:rStyle w:val="ac"/>
+          <w:lang w:val="ru-RU"/>
+        </w:rPr>
+        <w:t xml:space="preserve"> </w:t>
+      </w:r>
+      <w:r>
+        <w:rPr>
+          <w:rStyle w:val="ac"/>
+        </w:rPr>
+        <w:t>Web</w:t>
+      </w:r>
+      <w:r>
+        <w:rPr>
+          <w:rStyle w:val="ac"/>
+          <w:lang w:val="ru-RU"/>
+        </w:rPr>
+        <w:t xml:space="preserve"> </w:t>
+      </w:r>
+      <w:r>
+        <w:rPr>
+          <w:rStyle w:val="ac"/>
+        </w:rPr>
+        <w:t>Token</w:t>
+      </w:r>
+      <w:r>
+        <w:rPr>
+          <w:rStyle w:val="ac"/>
+          <w:lang w:val="ru-RU"/>
+        </w:rPr>
+        <w:t>)</w:t>
+      </w:r>
+      <w:r>
+        <w:rPr>
+          <w:lang w:val="ru-RU"/>
+        </w:rPr>
+        <w:t xml:space="preserve"> — компактный формат токена, используемый для безопасной передачи данных о пользователе и его правах.</w:t>
       </w:r>
     </w:p>
     <w:p>
@@ -11608,25 +11643,7 @@
         <w:rPr>
           <w:lang w:val="ru-RU"/>
         </w:rPr>
-        <w:t xml:space="preserve"> </w:t>
-      </w:r>
-      <w:r>
-        <w:rPr>
-          <w:lang w:val="ru-RU"/>
-        </w:rPr>
-        <w:t>–</w:t>
-      </w:r>
-      <w:r>
-        <w:rPr>
-          <w:lang w:val="ru-RU"/>
-        </w:rPr>
-        <w:t xml:space="preserve"> </w:t>
-      </w:r>
-      <w:r>
-        <w:rPr>
-          <w:lang w:val="ru-RU"/>
-        </w:rPr>
-        <w:t>требования к качественным характеристикам системы, включая производительность, надежность, безопасность и удобство сопровождения.</w:t>
+        <w:t xml:space="preserve"> – требования к качественным характеристикам системы, включая производительность, надежность, безопасность и удобство сопровождения.</w:t>
       </w:r>
     </w:p>
     <w:p>
@@ -11685,6 +11702,7 @@
             <w:jc w:val="center"/>
             <w:rPr>
               <w:noProof/>
+              <w:lang w:val="ru-RU"/>
             </w:rPr>
           </w:pPr>
           <w:r>
@@ -11763,10 +11781,14 @@
             <w:rPr>
               <w:rFonts w:asciiTheme="minorHAnsi" w:hAnsiTheme="minorHAnsi" w:cstheme="minorBidi"/>
               <w:noProof/>
-              <w:sz w:val="22"/>
+              <w:kern w:val="2"/>
+              <w:sz w:val="24"/>
+              <w:szCs w:val="24"/>
+              <w:lang w:val="ru-RU" w:eastAsia="ru-RU"/>
+              <w14:ligatures w14:val="standardContextual"/>
             </w:rPr>
           </w:pPr>
-          <w:hyperlink w:anchor="_Toc200356938" w:history="1">
+          <w:hyperlink w:anchor="_Toc227887512" w:history="1">
             <w:r>
               <w:rPr>
                 <w:rStyle w:val="aa"/>
@@ -11793,7 +11815,7 @@
                 <w:noProof/>
                 <w:webHidden/>
               </w:rPr>
-              <w:instrText xml:space="preserve"> PAGEREF _Toc200356938 \h </w:instrText>
+              <w:instrText xml:space="preserve"> PAGEREF _Toc227887512 \h </w:instrText>
             </w:r>
             <w:r>
               <w:rPr>
@@ -11828,27 +11850,35 @@
           <w:pPr>
             <w:pStyle w:val="11"/>
             <w:tabs>
-              <w:tab w:val="left" w:pos="440"/>
+              <w:tab w:val="left" w:pos="480"/>
             </w:tabs>
             <w:rPr>
               <w:rFonts w:asciiTheme="minorHAnsi" w:hAnsiTheme="minorHAnsi" w:cstheme="minorBidi"/>
               <w:noProof/>
-              <w:sz w:val="22"/>
+              <w:kern w:val="2"/>
+              <w:sz w:val="24"/>
+              <w:szCs w:val="24"/>
+              <w:lang w:val="ru-RU" w:eastAsia="ru-RU"/>
+              <w14:ligatures w14:val="standardContextual"/>
             </w:rPr>
           </w:pPr>
-          <w:hyperlink w:anchor="_Toc200356939" w:history="1">
+          <w:hyperlink w:anchor="_Toc227887513" w:history="1">
             <w:r>
               <w:rPr>
                 <w:rStyle w:val="aa"/>
                 <w:noProof/>
               </w:rPr>
-              <w:t>1</w:t>
+              <w:t>1.</w:t>
             </w:r>
             <w:r>
               <w:rPr>
                 <w:rFonts w:asciiTheme="minorHAnsi" w:hAnsiTheme="minorHAnsi" w:cstheme="minorBidi"/>
                 <w:noProof/>
-                <w:sz w:val="22"/>
+                <w:kern w:val="2"/>
+                <w:sz w:val="24"/>
+                <w:szCs w:val="24"/>
+                <w:lang w:val="ru-RU" w:eastAsia="ru-RU"/>
+                <w14:ligatures w14:val="standardContextual"/>
               </w:rPr>
               <w:tab/>
             </w:r>
@@ -11857,7 +11887,7 @@
                 <w:rStyle w:val="aa"/>
                 <w:noProof/>
               </w:rPr>
-              <w:t>Обзор используемых технологий</w:t>
+              <w:t>Системы аутентификации и авторизации</w:t>
             </w:r>
             <w:r>
               <w:rPr>
@@ -11878,7 +11908,7 @@
                 <w:noProof/>
                 <w:webHidden/>
               </w:rPr>
-              <w:instrText xml:space="preserve"> PAGEREF _Toc200356939 \h </w:instrText>
+              <w:instrText xml:space="preserve"> PAGEREF _Toc227887513 \h </w:instrText>
             </w:r>
             <w:r>
               <w:rPr>
@@ -11898,7 +11928,7 @@
                 <w:noProof/>
                 <w:webHidden/>
               </w:rPr>
-              <w:t>11</w:t>
+              <w:t>13</w:t>
             </w:r>
             <w:r>
               <w:rPr>
@@ -11913,27 +11943,35 @@
           <w:pPr>
             <w:pStyle w:val="11"/>
             <w:tabs>
-              <w:tab w:val="left" w:pos="440"/>
+              <w:tab w:val="left" w:pos="480"/>
             </w:tabs>
             <w:rPr>
               <w:rFonts w:asciiTheme="minorHAnsi" w:hAnsiTheme="minorHAnsi" w:cstheme="minorBidi"/>
               <w:noProof/>
-              <w:sz w:val="22"/>
+              <w:kern w:val="2"/>
+              <w:sz w:val="24"/>
+              <w:szCs w:val="24"/>
+              <w:lang w:val="ru-RU" w:eastAsia="ru-RU"/>
+              <w14:ligatures w14:val="standardContextual"/>
             </w:rPr>
           </w:pPr>
-          <w:hyperlink w:anchor="_Toc200356940" w:history="1">
+          <w:hyperlink w:anchor="_Toc227887514" w:history="1">
             <w:r>
               <w:rPr>
                 <w:rStyle w:val="aa"/>
                 <w:noProof/>
               </w:rPr>
-              <w:t>2</w:t>
+              <w:t>2.</w:t>
             </w:r>
             <w:r>
               <w:rPr>
                 <w:rFonts w:asciiTheme="minorHAnsi" w:hAnsiTheme="minorHAnsi" w:cstheme="minorBidi"/>
                 <w:noProof/>
-                <w:sz w:val="22"/>
+                <w:kern w:val="2"/>
+                <w:sz w:val="24"/>
+                <w:szCs w:val="24"/>
+                <w:lang w:val="ru-RU" w:eastAsia="ru-RU"/>
+                <w14:ligatures w14:val="standardContextual"/>
               </w:rPr>
               <w:tab/>
             </w:r>
@@ -11942,7 +11980,7 @@
                 <w:rStyle w:val="aa"/>
                 <w:noProof/>
               </w:rPr>
-              <w:t>Требования к пользовательскому интерфейсу</w:t>
+              <w:t>Обзор существующих SSO-решений</w:t>
             </w:r>
             <w:r>
               <w:rPr>
@@ -11963,7 +12001,7 @@
                 <w:noProof/>
                 <w:webHidden/>
               </w:rPr>
-              <w:instrText xml:space="preserve"> PAGEREF _Toc200356940 \h </w:instrText>
+              <w:instrText xml:space="preserve"> PAGEREF _Toc227887514 \h </w:instrText>
             </w:r>
             <w:r>
               <w:rPr>
@@ -11998,27 +12036,35 @@
           <w:pPr>
             <w:pStyle w:val="11"/>
             <w:tabs>
-              <w:tab w:val="left" w:pos="440"/>
+              <w:tab w:val="left" w:pos="480"/>
             </w:tabs>
             <w:rPr>
               <w:rFonts w:asciiTheme="minorHAnsi" w:hAnsiTheme="minorHAnsi" w:cstheme="minorBidi"/>
               <w:noProof/>
-              <w:sz w:val="22"/>
+              <w:kern w:val="2"/>
+              <w:sz w:val="24"/>
+              <w:szCs w:val="24"/>
+              <w:lang w:val="ru-RU" w:eastAsia="ru-RU"/>
+              <w14:ligatures w14:val="standardContextual"/>
             </w:rPr>
           </w:pPr>
-          <w:hyperlink w:anchor="_Toc200356941" w:history="1">
+          <w:hyperlink w:anchor="_Toc227887515" w:history="1">
             <w:r>
               <w:rPr>
                 <w:rStyle w:val="aa"/>
                 <w:noProof/>
               </w:rPr>
-              <w:t>3</w:t>
+              <w:t>3.</w:t>
             </w:r>
             <w:r>
               <w:rPr>
                 <w:rFonts w:asciiTheme="minorHAnsi" w:hAnsiTheme="minorHAnsi" w:cstheme="minorBidi"/>
                 <w:noProof/>
-                <w:sz w:val="22"/>
+                <w:kern w:val="2"/>
+                <w:sz w:val="24"/>
+                <w:szCs w:val="24"/>
+                <w:lang w:val="ru-RU" w:eastAsia="ru-RU"/>
+                <w14:ligatures w14:val="standardContextual"/>
               </w:rPr>
               <w:tab/>
             </w:r>
@@ -12027,7 +12073,7 @@
                 <w:rStyle w:val="aa"/>
                 <w:noProof/>
               </w:rPr>
-              <w:t>Авторизация пользователей</w:t>
+              <w:t>Получившаяся система</w:t>
             </w:r>
             <w:r>
               <w:rPr>
@@ -12048,7 +12094,7 @@
                 <w:noProof/>
                 <w:webHidden/>
               </w:rPr>
-              <w:instrText xml:space="preserve"> PAGEREF _Toc200356941 \h </w:instrText>
+              <w:instrText xml:space="preserve"> PAGEREF _Toc227887515 \h </w:instrText>
             </w:r>
             <w:r>
               <w:rPr>
@@ -12068,1368 +12114,7 @@
                 <w:noProof/>
                 <w:webHidden/>
               </w:rPr>
-              <w:t>18</w:t>
-            </w:r>
-            <w:r>
-              <w:rPr>
-                <w:noProof/>
-                <w:webHidden/>
-              </w:rPr>
-              <w:fldChar w:fldCharType="end"/>
-            </w:r>
-          </w:hyperlink>
-        </w:p>
-        <w:p>
-          <w:pPr>
-            <w:pStyle w:val="11"/>
-            <w:tabs>
-              <w:tab w:val="left" w:pos="440"/>
-            </w:tabs>
-            <w:rPr>
-              <w:rFonts w:asciiTheme="minorHAnsi" w:hAnsiTheme="minorHAnsi" w:cstheme="minorBidi"/>
-              <w:noProof/>
-              <w:sz w:val="22"/>
-            </w:rPr>
-          </w:pPr>
-          <w:hyperlink w:anchor="_Toc200356942" w:history="1">
-            <w:r>
-              <w:rPr>
-                <w:rStyle w:val="aa"/>
-                <w:noProof/>
-              </w:rPr>
-              <w:t>4</w:t>
-            </w:r>
-            <w:r>
-              <w:rPr>
-                <w:rFonts w:asciiTheme="minorHAnsi" w:hAnsiTheme="minorHAnsi" w:cstheme="minorBidi"/>
-                <w:noProof/>
-                <w:sz w:val="22"/>
-              </w:rPr>
-              <w:tab/>
-            </w:r>
-            <w:r>
-              <w:rPr>
-                <w:rStyle w:val="aa"/>
-                <w:noProof/>
-              </w:rPr>
-              <w:t>Разработка картографического модуля</w:t>
-            </w:r>
-            <w:r>
-              <w:rPr>
-                <w:noProof/>
-                <w:webHidden/>
-              </w:rPr>
-              <w:tab/>
-            </w:r>
-            <w:r>
-              <w:rPr>
-                <w:noProof/>
-                <w:webHidden/>
-              </w:rPr>
-              <w:fldChar w:fldCharType="begin"/>
-            </w:r>
-            <w:r>
-              <w:rPr>
-                <w:noProof/>
-                <w:webHidden/>
-              </w:rPr>
-              <w:instrText xml:space="preserve"> PAGEREF _Toc200356942 \h </w:instrText>
-            </w:r>
-            <w:r>
-              <w:rPr>
-                <w:noProof/>
-                <w:webHidden/>
-              </w:rPr>
-            </w:r>
-            <w:r>
-              <w:rPr>
-                <w:noProof/>
-                <w:webHidden/>
-              </w:rPr>
-              <w:fldChar w:fldCharType="separate"/>
-            </w:r>
-            <w:r>
-              <w:rPr>
-                <w:noProof/>
-                <w:webHidden/>
-              </w:rPr>
-              <w:t>20</w:t>
-            </w:r>
-            <w:r>
-              <w:rPr>
-                <w:noProof/>
-                <w:webHidden/>
-              </w:rPr>
-              <w:fldChar w:fldCharType="end"/>
-            </w:r>
-          </w:hyperlink>
-        </w:p>
-        <w:p>
-          <w:pPr>
-            <w:pStyle w:val="11"/>
-            <w:tabs>
-              <w:tab w:val="left" w:pos="440"/>
-            </w:tabs>
-            <w:rPr>
-              <w:rFonts w:asciiTheme="minorHAnsi" w:hAnsiTheme="minorHAnsi" w:cstheme="minorBidi"/>
-              <w:noProof/>
-              <w:sz w:val="22"/>
-            </w:rPr>
-          </w:pPr>
-          <w:hyperlink w:anchor="_Toc200356943" w:history="1">
-            <w:r>
-              <w:rPr>
-                <w:rStyle w:val="aa"/>
-                <w:noProof/>
-              </w:rPr>
-              <w:t>5</w:t>
-            </w:r>
-            <w:r>
-              <w:rPr>
-                <w:rFonts w:asciiTheme="minorHAnsi" w:hAnsiTheme="minorHAnsi" w:cstheme="minorBidi"/>
-                <w:noProof/>
-                <w:sz w:val="22"/>
-              </w:rPr>
-              <w:tab/>
-            </w:r>
-            <w:r>
-              <w:rPr>
-                <w:rStyle w:val="aa"/>
-                <w:noProof/>
-              </w:rPr>
-              <w:t>Разработка модуля дополненной реальности</w:t>
-            </w:r>
-            <w:r>
-              <w:rPr>
-                <w:noProof/>
-                <w:webHidden/>
-              </w:rPr>
-              <w:tab/>
-            </w:r>
-            <w:r>
-              <w:rPr>
-                <w:noProof/>
-                <w:webHidden/>
-              </w:rPr>
-              <w:fldChar w:fldCharType="begin"/>
-            </w:r>
-            <w:r>
-              <w:rPr>
-                <w:noProof/>
-                <w:webHidden/>
-              </w:rPr>
-              <w:instrText xml:space="preserve"> PAGEREF _Toc200356943 \h </w:instrText>
-            </w:r>
-            <w:r>
-              <w:rPr>
-                <w:noProof/>
-                <w:webHidden/>
-              </w:rPr>
-            </w:r>
-            <w:r>
-              <w:rPr>
-                <w:noProof/>
-                <w:webHidden/>
-              </w:rPr>
-              <w:fldChar w:fldCharType="separate"/>
-            </w:r>
-            <w:r>
-              <w:rPr>
-                <w:noProof/>
-                <w:webHidden/>
-              </w:rPr>
-              <w:t>26</w:t>
-            </w:r>
-            <w:r>
-              <w:rPr>
-                <w:noProof/>
-                <w:webHidden/>
-              </w:rPr>
-              <w:fldChar w:fldCharType="end"/>
-            </w:r>
-          </w:hyperlink>
-        </w:p>
-        <w:p>
-          <w:pPr>
-            <w:pStyle w:val="11"/>
-            <w:tabs>
-              <w:tab w:val="left" w:pos="440"/>
-            </w:tabs>
-            <w:rPr>
-              <w:rFonts w:asciiTheme="minorHAnsi" w:hAnsiTheme="minorHAnsi" w:cstheme="minorBidi"/>
-              <w:noProof/>
-              <w:sz w:val="22"/>
-            </w:rPr>
-          </w:pPr>
-          <w:hyperlink w:anchor="_Toc200356944" w:history="1">
-            <w:r>
-              <w:rPr>
-                <w:rStyle w:val="aa"/>
-                <w:noProof/>
-              </w:rPr>
-              <w:t>6</w:t>
-            </w:r>
-            <w:r>
-              <w:rPr>
-                <w:rFonts w:asciiTheme="minorHAnsi" w:hAnsiTheme="minorHAnsi" w:cstheme="minorBidi"/>
-                <w:noProof/>
-                <w:sz w:val="22"/>
-              </w:rPr>
-              <w:tab/>
-            </w:r>
-            <w:r>
-              <w:rPr>
-                <w:rStyle w:val="aa"/>
-                <w:noProof/>
-              </w:rPr>
-              <w:t>Методы загрузки работ в режиме AR</w:t>
-            </w:r>
-            <w:r>
-              <w:rPr>
-                <w:noProof/>
-                <w:webHidden/>
-              </w:rPr>
-              <w:tab/>
-            </w:r>
-            <w:r>
-              <w:rPr>
-                <w:noProof/>
-                <w:webHidden/>
-              </w:rPr>
-              <w:fldChar w:fldCharType="begin"/>
-            </w:r>
-            <w:r>
-              <w:rPr>
-                <w:noProof/>
-                <w:webHidden/>
-              </w:rPr>
-              <w:instrText xml:space="preserve"> PAGEREF _Toc200356944 \h </w:instrText>
-            </w:r>
-            <w:r>
-              <w:rPr>
-                <w:noProof/>
-                <w:webHidden/>
-              </w:rPr>
-            </w:r>
-            <w:r>
-              <w:rPr>
-                <w:noProof/>
-                <w:webHidden/>
-              </w:rPr>
-              <w:fldChar w:fldCharType="separate"/>
-            </w:r>
-            <w:r>
-              <w:rPr>
-                <w:noProof/>
-                <w:webHidden/>
-              </w:rPr>
-              <w:t>29</w:t>
-            </w:r>
-            <w:r>
-              <w:rPr>
-                <w:noProof/>
-                <w:webHidden/>
-              </w:rPr>
-              <w:fldChar w:fldCharType="end"/>
-            </w:r>
-          </w:hyperlink>
-        </w:p>
-        <w:p>
-          <w:pPr>
-            <w:pStyle w:val="11"/>
-            <w:tabs>
-              <w:tab w:val="left" w:pos="440"/>
-            </w:tabs>
-            <w:rPr>
-              <w:rFonts w:asciiTheme="minorHAnsi" w:hAnsiTheme="minorHAnsi" w:cstheme="minorBidi"/>
-              <w:noProof/>
-              <w:sz w:val="22"/>
-            </w:rPr>
-          </w:pPr>
-          <w:hyperlink w:anchor="_Toc200356945" w:history="1">
-            <w:r>
-              <w:rPr>
-                <w:rStyle w:val="aa"/>
-                <w:noProof/>
-              </w:rPr>
-              <w:t>7</w:t>
-            </w:r>
-            <w:r>
-              <w:rPr>
-                <w:rFonts w:asciiTheme="minorHAnsi" w:hAnsiTheme="minorHAnsi" w:cstheme="minorBidi"/>
-                <w:noProof/>
-                <w:sz w:val="22"/>
-              </w:rPr>
-              <w:tab/>
-            </w:r>
-            <w:r>
-              <w:rPr>
-                <w:rStyle w:val="aa"/>
-                <w:noProof/>
-              </w:rPr>
-              <w:t>Разработка GPT-ассистента</w:t>
-            </w:r>
-            <w:r>
-              <w:rPr>
-                <w:noProof/>
-                <w:webHidden/>
-              </w:rPr>
-              <w:tab/>
-            </w:r>
-            <w:r>
-              <w:rPr>
-                <w:noProof/>
-                <w:webHidden/>
-              </w:rPr>
-              <w:fldChar w:fldCharType="begin"/>
-            </w:r>
-            <w:r>
-              <w:rPr>
-                <w:noProof/>
-                <w:webHidden/>
-              </w:rPr>
-              <w:instrText xml:space="preserve"> PAGEREF _Toc200356945 \h </w:instrText>
-            </w:r>
-            <w:r>
-              <w:rPr>
-                <w:noProof/>
-                <w:webHidden/>
-              </w:rPr>
-            </w:r>
-            <w:r>
-              <w:rPr>
-                <w:noProof/>
-                <w:webHidden/>
-              </w:rPr>
-              <w:fldChar w:fldCharType="separate"/>
-            </w:r>
-            <w:r>
-              <w:rPr>
-                <w:noProof/>
-                <w:webHidden/>
-              </w:rPr>
-              <w:t>31</w:t>
-            </w:r>
-            <w:r>
-              <w:rPr>
-                <w:noProof/>
-                <w:webHidden/>
-              </w:rPr>
-              <w:fldChar w:fldCharType="end"/>
-            </w:r>
-          </w:hyperlink>
-        </w:p>
-        <w:p>
-          <w:pPr>
-            <w:pStyle w:val="11"/>
-            <w:tabs>
-              <w:tab w:val="left" w:pos="660"/>
-            </w:tabs>
-            <w:rPr>
-              <w:rFonts w:asciiTheme="minorHAnsi" w:hAnsiTheme="minorHAnsi" w:cstheme="minorBidi"/>
-              <w:noProof/>
-              <w:sz w:val="22"/>
-            </w:rPr>
-          </w:pPr>
-          <w:hyperlink w:anchor="_Toc200356946" w:history="1">
-            <w:r>
-              <w:rPr>
-                <w:rStyle w:val="aa"/>
-                <w:noProof/>
-              </w:rPr>
-              <w:t>7.1</w:t>
-            </w:r>
-            <w:r>
-              <w:rPr>
-                <w:rFonts w:asciiTheme="minorHAnsi" w:hAnsiTheme="minorHAnsi" w:cstheme="minorBidi"/>
-                <w:noProof/>
-                <w:sz w:val="22"/>
-              </w:rPr>
-              <w:tab/>
-            </w:r>
-            <w:r>
-              <w:rPr>
-                <w:rStyle w:val="aa"/>
-                <w:noProof/>
-              </w:rPr>
-              <w:t>Интеграция с OpenAI</w:t>
-            </w:r>
-            <w:r>
-              <w:rPr>
-                <w:noProof/>
-                <w:webHidden/>
-              </w:rPr>
-              <w:tab/>
-            </w:r>
-            <w:r>
-              <w:rPr>
-                <w:noProof/>
-                <w:webHidden/>
-              </w:rPr>
-              <w:fldChar w:fldCharType="begin"/>
-            </w:r>
-            <w:r>
-              <w:rPr>
-                <w:noProof/>
-                <w:webHidden/>
-              </w:rPr>
-              <w:instrText xml:space="preserve"> PAGEREF _Toc200356946 \h </w:instrText>
-            </w:r>
-            <w:r>
-              <w:rPr>
-                <w:noProof/>
-                <w:webHidden/>
-              </w:rPr>
-            </w:r>
-            <w:r>
-              <w:rPr>
-                <w:noProof/>
-                <w:webHidden/>
-              </w:rPr>
-              <w:fldChar w:fldCharType="separate"/>
-            </w:r>
-            <w:r>
-              <w:rPr>
-                <w:noProof/>
-                <w:webHidden/>
-              </w:rPr>
-              <w:t>31</w:t>
-            </w:r>
-            <w:r>
-              <w:rPr>
-                <w:noProof/>
-                <w:webHidden/>
-              </w:rPr>
-              <w:fldChar w:fldCharType="end"/>
-            </w:r>
-          </w:hyperlink>
-        </w:p>
-        <w:p>
-          <w:pPr>
-            <w:pStyle w:val="11"/>
-            <w:tabs>
-              <w:tab w:val="left" w:pos="660"/>
-            </w:tabs>
-            <w:rPr>
-              <w:rFonts w:asciiTheme="minorHAnsi" w:hAnsiTheme="minorHAnsi" w:cstheme="minorBidi"/>
-              <w:noProof/>
-              <w:sz w:val="22"/>
-            </w:rPr>
-          </w:pPr>
-          <w:hyperlink w:anchor="_Toc200356947" w:history="1">
-            <w:r>
-              <w:rPr>
-                <w:rStyle w:val="aa"/>
-                <w:noProof/>
-              </w:rPr>
-              <w:t>7.2</w:t>
-            </w:r>
-            <w:r>
-              <w:rPr>
-                <w:rFonts w:asciiTheme="minorHAnsi" w:hAnsiTheme="minorHAnsi" w:cstheme="minorBidi"/>
-                <w:noProof/>
-                <w:sz w:val="22"/>
-              </w:rPr>
-              <w:tab/>
-            </w:r>
-            <w:r>
-              <w:rPr>
-                <w:rStyle w:val="aa"/>
-                <w:noProof/>
-              </w:rPr>
-              <w:t>Обработка запросов пользователя к GPT-ассистенту</w:t>
-            </w:r>
-            <w:r>
-              <w:rPr>
-                <w:noProof/>
-                <w:webHidden/>
-              </w:rPr>
-              <w:tab/>
-            </w:r>
-            <w:r>
-              <w:rPr>
-                <w:noProof/>
-                <w:webHidden/>
-              </w:rPr>
-              <w:fldChar w:fldCharType="begin"/>
-            </w:r>
-            <w:r>
-              <w:rPr>
-                <w:noProof/>
-                <w:webHidden/>
-              </w:rPr>
-              <w:instrText xml:space="preserve"> PAGEREF _Toc200356947 \h </w:instrText>
-            </w:r>
-            <w:r>
-              <w:rPr>
-                <w:noProof/>
-                <w:webHidden/>
-              </w:rPr>
-            </w:r>
-            <w:r>
-              <w:rPr>
-                <w:noProof/>
-                <w:webHidden/>
-              </w:rPr>
-              <w:fldChar w:fldCharType="separate"/>
-            </w:r>
-            <w:r>
-              <w:rPr>
-                <w:noProof/>
-                <w:webHidden/>
-              </w:rPr>
-              <w:t>33</w:t>
-            </w:r>
-            <w:r>
-              <w:rPr>
-                <w:noProof/>
-                <w:webHidden/>
-              </w:rPr>
-              <w:fldChar w:fldCharType="end"/>
-            </w:r>
-          </w:hyperlink>
-        </w:p>
-        <w:p>
-          <w:pPr>
-            <w:pStyle w:val="11"/>
-            <w:tabs>
-              <w:tab w:val="left" w:pos="660"/>
-            </w:tabs>
-            <w:rPr>
-              <w:rFonts w:asciiTheme="minorHAnsi" w:hAnsiTheme="minorHAnsi" w:cstheme="minorBidi"/>
-              <w:noProof/>
-              <w:sz w:val="22"/>
-            </w:rPr>
-          </w:pPr>
-          <w:hyperlink w:anchor="_Toc200356948" w:history="1">
-            <w:r>
-              <w:rPr>
-                <w:rStyle w:val="aa"/>
-                <w:noProof/>
-              </w:rPr>
-              <w:t>7.3</w:t>
-            </w:r>
-            <w:r>
-              <w:rPr>
-                <w:rFonts w:asciiTheme="minorHAnsi" w:hAnsiTheme="minorHAnsi" w:cstheme="minorBidi"/>
-                <w:noProof/>
-                <w:sz w:val="22"/>
-              </w:rPr>
-              <w:tab/>
-            </w:r>
-            <w:r>
-              <w:rPr>
-                <w:rStyle w:val="aa"/>
-                <w:noProof/>
-              </w:rPr>
-              <w:t>Разработка промптов</w:t>
-            </w:r>
-            <w:r>
-              <w:rPr>
-                <w:noProof/>
-                <w:webHidden/>
-              </w:rPr>
-              <w:tab/>
-            </w:r>
-            <w:r>
-              <w:rPr>
-                <w:noProof/>
-                <w:webHidden/>
-              </w:rPr>
-              <w:fldChar w:fldCharType="begin"/>
-            </w:r>
-            <w:r>
-              <w:rPr>
-                <w:noProof/>
-                <w:webHidden/>
-              </w:rPr>
-              <w:instrText xml:space="preserve"> PAGEREF _Toc200356948 \h </w:instrText>
-            </w:r>
-            <w:r>
-              <w:rPr>
-                <w:noProof/>
-                <w:webHidden/>
-              </w:rPr>
-            </w:r>
-            <w:r>
-              <w:rPr>
-                <w:noProof/>
-                <w:webHidden/>
-              </w:rPr>
-              <w:fldChar w:fldCharType="separate"/>
-            </w:r>
-            <w:r>
-              <w:rPr>
-                <w:noProof/>
-                <w:webHidden/>
-              </w:rPr>
-              <w:t>37</w:t>
-            </w:r>
-            <w:r>
-              <w:rPr>
-                <w:noProof/>
-                <w:webHidden/>
-              </w:rPr>
-              <w:fldChar w:fldCharType="end"/>
-            </w:r>
-          </w:hyperlink>
-        </w:p>
-        <w:p>
-          <w:pPr>
-            <w:pStyle w:val="11"/>
-            <w:tabs>
-              <w:tab w:val="left" w:pos="660"/>
-            </w:tabs>
-            <w:rPr>
-              <w:rFonts w:asciiTheme="minorHAnsi" w:hAnsiTheme="minorHAnsi" w:cstheme="minorBidi"/>
-              <w:noProof/>
-              <w:sz w:val="22"/>
-            </w:rPr>
-          </w:pPr>
-          <w:hyperlink w:anchor="_Toc200356949" w:history="1">
-            <w:r>
-              <w:rPr>
-                <w:rStyle w:val="aa"/>
-                <w:noProof/>
-              </w:rPr>
-              <w:t>7.4</w:t>
-            </w:r>
-            <w:r>
-              <w:rPr>
-                <w:rFonts w:asciiTheme="minorHAnsi" w:hAnsiTheme="minorHAnsi" w:cstheme="minorBidi"/>
-                <w:noProof/>
-                <w:sz w:val="22"/>
-              </w:rPr>
-              <w:tab/>
-            </w:r>
-            <w:r>
-              <w:rPr>
-                <w:rStyle w:val="aa"/>
-                <w:noProof/>
-              </w:rPr>
-              <w:t>Реализация генерации ответа</w:t>
-            </w:r>
-            <w:r>
-              <w:rPr>
-                <w:noProof/>
-                <w:webHidden/>
-              </w:rPr>
-              <w:tab/>
-            </w:r>
-            <w:r>
-              <w:rPr>
-                <w:noProof/>
-                <w:webHidden/>
-              </w:rPr>
-              <w:fldChar w:fldCharType="begin"/>
-            </w:r>
-            <w:r>
-              <w:rPr>
-                <w:noProof/>
-                <w:webHidden/>
-              </w:rPr>
-              <w:instrText xml:space="preserve"> PAGEREF _Toc200356949 \h </w:instrText>
-            </w:r>
-            <w:r>
-              <w:rPr>
-                <w:noProof/>
-                <w:webHidden/>
-              </w:rPr>
-            </w:r>
-            <w:r>
-              <w:rPr>
-                <w:noProof/>
-                <w:webHidden/>
-              </w:rPr>
-              <w:fldChar w:fldCharType="separate"/>
-            </w:r>
-            <w:r>
-              <w:rPr>
-                <w:noProof/>
-                <w:webHidden/>
-              </w:rPr>
-              <w:t>43</w:t>
-            </w:r>
-            <w:r>
-              <w:rPr>
-                <w:noProof/>
-                <w:webHidden/>
-              </w:rPr>
-              <w:fldChar w:fldCharType="end"/>
-            </w:r>
-          </w:hyperlink>
-        </w:p>
-        <w:p>
-          <w:pPr>
-            <w:pStyle w:val="11"/>
-            <w:tabs>
-              <w:tab w:val="left" w:pos="440"/>
-            </w:tabs>
-            <w:rPr>
-              <w:rFonts w:asciiTheme="minorHAnsi" w:hAnsiTheme="minorHAnsi" w:cstheme="minorBidi"/>
-              <w:noProof/>
-              <w:sz w:val="22"/>
-            </w:rPr>
-          </w:pPr>
-          <w:hyperlink w:anchor="_Toc200356950" w:history="1">
-            <w:r>
-              <w:rPr>
-                <w:rStyle w:val="aa"/>
-                <w:noProof/>
-              </w:rPr>
-              <w:t>8</w:t>
-            </w:r>
-            <w:r>
-              <w:rPr>
-                <w:rFonts w:asciiTheme="minorHAnsi" w:hAnsiTheme="minorHAnsi" w:cstheme="minorBidi"/>
-                <w:noProof/>
-                <w:sz w:val="22"/>
-              </w:rPr>
-              <w:tab/>
-            </w:r>
-            <w:r>
-              <w:rPr>
-                <w:rStyle w:val="aa"/>
-                <w:noProof/>
-              </w:rPr>
-              <w:t>Организация системы подписки</w:t>
-            </w:r>
-            <w:r>
-              <w:rPr>
-                <w:noProof/>
-                <w:webHidden/>
-              </w:rPr>
-              <w:tab/>
-            </w:r>
-            <w:r>
-              <w:rPr>
-                <w:noProof/>
-                <w:webHidden/>
-              </w:rPr>
-              <w:fldChar w:fldCharType="begin"/>
-            </w:r>
-            <w:r>
-              <w:rPr>
-                <w:noProof/>
-                <w:webHidden/>
-              </w:rPr>
-              <w:instrText xml:space="preserve"> PAGEREF _Toc200356950 \h </w:instrText>
-            </w:r>
-            <w:r>
-              <w:rPr>
-                <w:noProof/>
-                <w:webHidden/>
-              </w:rPr>
-            </w:r>
-            <w:r>
-              <w:rPr>
-                <w:noProof/>
-                <w:webHidden/>
-              </w:rPr>
-              <w:fldChar w:fldCharType="separate"/>
-            </w:r>
-            <w:r>
-              <w:rPr>
-                <w:noProof/>
-                <w:webHidden/>
-              </w:rPr>
-              <w:t>51</w:t>
-            </w:r>
-            <w:r>
-              <w:rPr>
-                <w:noProof/>
-                <w:webHidden/>
-              </w:rPr>
-              <w:fldChar w:fldCharType="end"/>
-            </w:r>
-          </w:hyperlink>
-        </w:p>
-        <w:p>
-          <w:pPr>
-            <w:pStyle w:val="11"/>
-            <w:tabs>
-              <w:tab w:val="left" w:pos="660"/>
-            </w:tabs>
-            <w:rPr>
-              <w:rFonts w:asciiTheme="minorHAnsi" w:hAnsiTheme="minorHAnsi" w:cstheme="minorBidi"/>
-              <w:noProof/>
-              <w:sz w:val="22"/>
-            </w:rPr>
-          </w:pPr>
-          <w:hyperlink w:anchor="_Toc200356951" w:history="1">
-            <w:r>
-              <w:rPr>
-                <w:rStyle w:val="aa"/>
-                <w:noProof/>
-              </w:rPr>
-              <w:t>8.1</w:t>
-            </w:r>
-            <w:r>
-              <w:rPr>
-                <w:rFonts w:asciiTheme="minorHAnsi" w:hAnsiTheme="minorHAnsi" w:cstheme="minorBidi"/>
-                <w:noProof/>
-                <w:sz w:val="22"/>
-              </w:rPr>
-              <w:tab/>
-            </w:r>
-            <w:r>
-              <w:rPr>
-                <w:rStyle w:val="aa"/>
-                <w:noProof/>
-              </w:rPr>
-              <w:t>Выбор платежной системы</w:t>
-            </w:r>
-            <w:r>
-              <w:rPr>
-                <w:noProof/>
-                <w:webHidden/>
-              </w:rPr>
-              <w:tab/>
-            </w:r>
-            <w:r>
-              <w:rPr>
-                <w:noProof/>
-                <w:webHidden/>
-              </w:rPr>
-              <w:fldChar w:fldCharType="begin"/>
-            </w:r>
-            <w:r>
-              <w:rPr>
-                <w:noProof/>
-                <w:webHidden/>
-              </w:rPr>
-              <w:instrText xml:space="preserve"> PAGEREF _Toc200356951 \h </w:instrText>
-            </w:r>
-            <w:r>
-              <w:rPr>
-                <w:noProof/>
-                <w:webHidden/>
-              </w:rPr>
-            </w:r>
-            <w:r>
-              <w:rPr>
-                <w:noProof/>
-                <w:webHidden/>
-              </w:rPr>
-              <w:fldChar w:fldCharType="separate"/>
-            </w:r>
-            <w:r>
-              <w:rPr>
-                <w:noProof/>
-                <w:webHidden/>
-              </w:rPr>
-              <w:t>51</w:t>
-            </w:r>
-            <w:r>
-              <w:rPr>
-                <w:noProof/>
-                <w:webHidden/>
-              </w:rPr>
-              <w:fldChar w:fldCharType="end"/>
-            </w:r>
-          </w:hyperlink>
-        </w:p>
-        <w:p>
-          <w:pPr>
-            <w:pStyle w:val="11"/>
-            <w:tabs>
-              <w:tab w:val="left" w:pos="660"/>
-            </w:tabs>
-            <w:rPr>
-              <w:rFonts w:asciiTheme="minorHAnsi" w:hAnsiTheme="minorHAnsi" w:cstheme="minorBidi"/>
-              <w:noProof/>
-              <w:sz w:val="22"/>
-            </w:rPr>
-          </w:pPr>
-          <w:hyperlink w:anchor="_Toc200356952" w:history="1">
-            <w:r>
-              <w:rPr>
-                <w:rStyle w:val="aa"/>
-                <w:noProof/>
-              </w:rPr>
-              <w:t>8.2</w:t>
-            </w:r>
-            <w:r>
-              <w:rPr>
-                <w:rFonts w:asciiTheme="minorHAnsi" w:hAnsiTheme="minorHAnsi" w:cstheme="minorBidi"/>
-                <w:noProof/>
-                <w:sz w:val="22"/>
-              </w:rPr>
-              <w:tab/>
-            </w:r>
-            <w:r>
-              <w:rPr>
-                <w:rStyle w:val="aa"/>
-                <w:noProof/>
-              </w:rPr>
-              <w:t>Использование Stripe в проекте</w:t>
-            </w:r>
-            <w:r>
-              <w:rPr>
-                <w:noProof/>
-                <w:webHidden/>
-              </w:rPr>
-              <w:tab/>
-            </w:r>
-            <w:r>
-              <w:rPr>
-                <w:noProof/>
-                <w:webHidden/>
-              </w:rPr>
-              <w:fldChar w:fldCharType="begin"/>
-            </w:r>
-            <w:r>
-              <w:rPr>
-                <w:noProof/>
-                <w:webHidden/>
-              </w:rPr>
-              <w:instrText xml:space="preserve"> PAGEREF _Toc200356952 \h </w:instrText>
-            </w:r>
-            <w:r>
-              <w:rPr>
-                <w:noProof/>
-                <w:webHidden/>
-              </w:rPr>
-            </w:r>
-            <w:r>
-              <w:rPr>
-                <w:noProof/>
-                <w:webHidden/>
-              </w:rPr>
-              <w:fldChar w:fldCharType="separate"/>
-            </w:r>
-            <w:r>
-              <w:rPr>
-                <w:noProof/>
-                <w:webHidden/>
-              </w:rPr>
-              <w:t>52</w:t>
-            </w:r>
-            <w:r>
-              <w:rPr>
-                <w:noProof/>
-                <w:webHidden/>
-              </w:rPr>
-              <w:fldChar w:fldCharType="end"/>
-            </w:r>
-          </w:hyperlink>
-        </w:p>
-        <w:p>
-          <w:pPr>
-            <w:pStyle w:val="11"/>
-            <w:tabs>
-              <w:tab w:val="left" w:pos="660"/>
-            </w:tabs>
-            <w:rPr>
-              <w:rFonts w:asciiTheme="minorHAnsi" w:hAnsiTheme="minorHAnsi" w:cstheme="minorBidi"/>
-              <w:noProof/>
-              <w:sz w:val="22"/>
-            </w:rPr>
-          </w:pPr>
-          <w:hyperlink w:anchor="_Toc200356953" w:history="1">
-            <w:r>
-              <w:rPr>
-                <w:rStyle w:val="aa"/>
-                <w:noProof/>
-              </w:rPr>
-              <w:t>8.3</w:t>
-            </w:r>
-            <w:r>
-              <w:rPr>
-                <w:rFonts w:asciiTheme="minorHAnsi" w:hAnsiTheme="minorHAnsi" w:cstheme="minorBidi"/>
-                <w:noProof/>
-                <w:sz w:val="22"/>
-              </w:rPr>
-              <w:tab/>
-            </w:r>
-            <w:r>
-              <w:rPr>
-                <w:rStyle w:val="aa"/>
-                <w:noProof/>
-              </w:rPr>
-              <w:t>Структура БД и ее связь с Stripe</w:t>
-            </w:r>
-            <w:r>
-              <w:rPr>
-                <w:noProof/>
-                <w:webHidden/>
-              </w:rPr>
-              <w:tab/>
-            </w:r>
-            <w:r>
-              <w:rPr>
-                <w:noProof/>
-                <w:webHidden/>
-              </w:rPr>
-              <w:fldChar w:fldCharType="begin"/>
-            </w:r>
-            <w:r>
-              <w:rPr>
-                <w:noProof/>
-                <w:webHidden/>
-              </w:rPr>
-              <w:instrText xml:space="preserve"> PAGEREF _Toc200356953 \h </w:instrText>
-            </w:r>
-            <w:r>
-              <w:rPr>
-                <w:noProof/>
-                <w:webHidden/>
-              </w:rPr>
-            </w:r>
-            <w:r>
-              <w:rPr>
-                <w:noProof/>
-                <w:webHidden/>
-              </w:rPr>
-              <w:fldChar w:fldCharType="separate"/>
-            </w:r>
-            <w:r>
-              <w:rPr>
-                <w:noProof/>
-                <w:webHidden/>
-              </w:rPr>
-              <w:t>57</w:t>
-            </w:r>
-            <w:r>
-              <w:rPr>
-                <w:noProof/>
-                <w:webHidden/>
-              </w:rPr>
-              <w:fldChar w:fldCharType="end"/>
-            </w:r>
-          </w:hyperlink>
-        </w:p>
-        <w:p>
-          <w:pPr>
-            <w:pStyle w:val="11"/>
-            <w:tabs>
-              <w:tab w:val="left" w:pos="440"/>
-            </w:tabs>
-            <w:rPr>
-              <w:rFonts w:asciiTheme="minorHAnsi" w:hAnsiTheme="minorHAnsi" w:cstheme="minorBidi"/>
-              <w:noProof/>
-              <w:sz w:val="22"/>
-            </w:rPr>
-          </w:pPr>
-          <w:hyperlink w:anchor="_Toc200356954" w:history="1">
-            <w:r>
-              <w:rPr>
-                <w:rStyle w:val="aa"/>
-                <w:noProof/>
-              </w:rPr>
-              <w:t>9</w:t>
-            </w:r>
-            <w:r>
-              <w:rPr>
-                <w:rFonts w:asciiTheme="minorHAnsi" w:hAnsiTheme="minorHAnsi" w:cstheme="minorBidi"/>
-                <w:noProof/>
-                <w:sz w:val="22"/>
-              </w:rPr>
-              <w:tab/>
-            </w:r>
-            <w:r>
-              <w:rPr>
-                <w:rStyle w:val="aa"/>
-                <w:noProof/>
-              </w:rPr>
-              <w:t>Архитектура взаимодействия компонентов приложения</w:t>
-            </w:r>
-            <w:r>
-              <w:rPr>
-                <w:noProof/>
-                <w:webHidden/>
-              </w:rPr>
-              <w:tab/>
-            </w:r>
-            <w:r>
-              <w:rPr>
-                <w:noProof/>
-                <w:webHidden/>
-              </w:rPr>
-              <w:fldChar w:fldCharType="begin"/>
-            </w:r>
-            <w:r>
-              <w:rPr>
-                <w:noProof/>
-                <w:webHidden/>
-              </w:rPr>
-              <w:instrText xml:space="preserve"> PAGEREF _Toc200356954 \h </w:instrText>
-            </w:r>
-            <w:r>
-              <w:rPr>
-                <w:noProof/>
-                <w:webHidden/>
-              </w:rPr>
-            </w:r>
-            <w:r>
-              <w:rPr>
-                <w:noProof/>
-                <w:webHidden/>
-              </w:rPr>
-              <w:fldChar w:fldCharType="separate"/>
-            </w:r>
-            <w:r>
-              <w:rPr>
-                <w:noProof/>
-                <w:webHidden/>
-              </w:rPr>
-              <w:t>61</w:t>
-            </w:r>
-            <w:r>
-              <w:rPr>
-                <w:noProof/>
-                <w:webHidden/>
-              </w:rPr>
-              <w:fldChar w:fldCharType="end"/>
-            </w:r>
-          </w:hyperlink>
-        </w:p>
-        <w:p>
-          <w:pPr>
-            <w:pStyle w:val="11"/>
-            <w:tabs>
-              <w:tab w:val="left" w:pos="660"/>
-            </w:tabs>
-            <w:rPr>
-              <w:rFonts w:asciiTheme="minorHAnsi" w:hAnsiTheme="minorHAnsi" w:cstheme="minorBidi"/>
-              <w:noProof/>
-              <w:sz w:val="22"/>
-            </w:rPr>
-          </w:pPr>
-          <w:hyperlink w:anchor="_Toc200356955" w:history="1">
-            <w:r>
-              <w:rPr>
-                <w:rStyle w:val="aa"/>
-                <w:noProof/>
-              </w:rPr>
-              <w:t>9.1</w:t>
-            </w:r>
-            <w:r>
-              <w:rPr>
-                <w:rFonts w:asciiTheme="minorHAnsi" w:hAnsiTheme="minorHAnsi" w:cstheme="minorBidi"/>
-                <w:noProof/>
-                <w:sz w:val="22"/>
-              </w:rPr>
-              <w:tab/>
-            </w:r>
-            <w:r>
-              <w:rPr>
-                <w:rStyle w:val="aa"/>
-                <w:noProof/>
-              </w:rPr>
-              <w:t>Общая архитектурная схема приложения</w:t>
-            </w:r>
-            <w:r>
-              <w:rPr>
-                <w:noProof/>
-                <w:webHidden/>
-              </w:rPr>
-              <w:tab/>
-            </w:r>
-            <w:r>
-              <w:rPr>
-                <w:noProof/>
-                <w:webHidden/>
-              </w:rPr>
-              <w:fldChar w:fldCharType="begin"/>
-            </w:r>
-            <w:r>
-              <w:rPr>
-                <w:noProof/>
-                <w:webHidden/>
-              </w:rPr>
-              <w:instrText xml:space="preserve"> PAGEREF _Toc200356955 \h </w:instrText>
-            </w:r>
-            <w:r>
-              <w:rPr>
-                <w:noProof/>
-                <w:webHidden/>
-              </w:rPr>
-            </w:r>
-            <w:r>
-              <w:rPr>
-                <w:noProof/>
-                <w:webHidden/>
-              </w:rPr>
-              <w:fldChar w:fldCharType="separate"/>
-            </w:r>
-            <w:r>
-              <w:rPr>
-                <w:noProof/>
-                <w:webHidden/>
-              </w:rPr>
-              <w:t>61</w:t>
-            </w:r>
-            <w:r>
-              <w:rPr>
-                <w:noProof/>
-                <w:webHidden/>
-              </w:rPr>
-              <w:fldChar w:fldCharType="end"/>
-            </w:r>
-          </w:hyperlink>
-        </w:p>
-        <w:p>
-          <w:pPr>
-            <w:pStyle w:val="11"/>
-            <w:tabs>
-              <w:tab w:val="left" w:pos="660"/>
-            </w:tabs>
-            <w:rPr>
-              <w:rFonts w:asciiTheme="minorHAnsi" w:hAnsiTheme="minorHAnsi" w:cstheme="minorBidi"/>
-              <w:noProof/>
-              <w:sz w:val="22"/>
-            </w:rPr>
-          </w:pPr>
-          <w:hyperlink w:anchor="_Toc200356956" w:history="1">
-            <w:r>
-              <w:rPr>
-                <w:rStyle w:val="aa"/>
-                <w:noProof/>
-              </w:rPr>
-              <w:t>9.2</w:t>
-            </w:r>
-            <w:r>
-              <w:rPr>
-                <w:rFonts w:asciiTheme="minorHAnsi" w:hAnsiTheme="minorHAnsi" w:cstheme="minorBidi"/>
-                <w:noProof/>
-                <w:sz w:val="22"/>
-              </w:rPr>
-              <w:tab/>
-            </w:r>
-            <w:r>
-              <w:rPr>
-                <w:rStyle w:val="aa"/>
-                <w:noProof/>
-              </w:rPr>
-              <w:t>Инфраструктура AI-компонента</w:t>
-            </w:r>
-            <w:r>
-              <w:rPr>
-                <w:noProof/>
-                <w:webHidden/>
-              </w:rPr>
-              <w:tab/>
-            </w:r>
-            <w:r>
-              <w:rPr>
-                <w:noProof/>
-                <w:webHidden/>
-              </w:rPr>
-              <w:fldChar w:fldCharType="begin"/>
-            </w:r>
-            <w:r>
-              <w:rPr>
-                <w:noProof/>
-                <w:webHidden/>
-              </w:rPr>
-              <w:instrText xml:space="preserve"> PAGEREF _Toc200356956 \h </w:instrText>
-            </w:r>
-            <w:r>
-              <w:rPr>
-                <w:noProof/>
-                <w:webHidden/>
-              </w:rPr>
-            </w:r>
-            <w:r>
-              <w:rPr>
-                <w:noProof/>
-                <w:webHidden/>
-              </w:rPr>
-              <w:fldChar w:fldCharType="separate"/>
-            </w:r>
-            <w:r>
-              <w:rPr>
-                <w:noProof/>
-                <w:webHidden/>
-              </w:rPr>
-              <w:t>62</w:t>
-            </w:r>
-            <w:r>
-              <w:rPr>
-                <w:noProof/>
-                <w:webHidden/>
-              </w:rPr>
-              <w:fldChar w:fldCharType="end"/>
-            </w:r>
-          </w:hyperlink>
-        </w:p>
-        <w:p>
-          <w:pPr>
-            <w:pStyle w:val="11"/>
-            <w:tabs>
-              <w:tab w:val="left" w:pos="660"/>
-            </w:tabs>
-            <w:rPr>
-              <w:rFonts w:asciiTheme="minorHAnsi" w:hAnsiTheme="minorHAnsi" w:cstheme="minorBidi"/>
-              <w:noProof/>
-              <w:sz w:val="22"/>
-            </w:rPr>
-          </w:pPr>
-          <w:hyperlink w:anchor="_Toc200356957" w:history="1">
-            <w:r>
-              <w:rPr>
-                <w:rStyle w:val="aa"/>
-                <w:rFonts w:eastAsia="Times New Roman"/>
-                <w:noProof/>
-              </w:rPr>
-              <w:t>9.3</w:t>
-            </w:r>
-            <w:r>
-              <w:rPr>
-                <w:rFonts w:asciiTheme="minorHAnsi" w:hAnsiTheme="minorHAnsi" w:cstheme="minorBidi"/>
-                <w:noProof/>
-                <w:sz w:val="22"/>
-              </w:rPr>
-              <w:tab/>
-            </w:r>
-            <w:r>
-              <w:rPr>
-                <w:rStyle w:val="aa"/>
-                <w:noProof/>
-              </w:rPr>
-              <w:t>Перспективы масштабирования</w:t>
-            </w:r>
-            <w:r>
-              <w:rPr>
-                <w:noProof/>
-                <w:webHidden/>
-              </w:rPr>
-              <w:tab/>
-            </w:r>
-            <w:r>
-              <w:rPr>
-                <w:noProof/>
-                <w:webHidden/>
-              </w:rPr>
-              <w:fldChar w:fldCharType="begin"/>
-            </w:r>
-            <w:r>
-              <w:rPr>
-                <w:noProof/>
-                <w:webHidden/>
-              </w:rPr>
-              <w:instrText xml:space="preserve"> PAGEREF _Toc200356957 \h </w:instrText>
-            </w:r>
-            <w:r>
-              <w:rPr>
-                <w:noProof/>
-                <w:webHidden/>
-              </w:rPr>
-            </w:r>
-            <w:r>
-              <w:rPr>
-                <w:noProof/>
-                <w:webHidden/>
-              </w:rPr>
-              <w:fldChar w:fldCharType="separate"/>
-            </w:r>
-            <w:r>
-              <w:rPr>
-                <w:noProof/>
-                <w:webHidden/>
-              </w:rPr>
-              <w:t>62</w:t>
+              <w:t>19</w:t>
             </w:r>
             <w:r>
               <w:rPr>
@@ -13446,10 +12131,14 @@
             <w:rPr>
               <w:rFonts w:asciiTheme="minorHAnsi" w:hAnsiTheme="minorHAnsi" w:cstheme="minorBidi"/>
               <w:noProof/>
-              <w:sz w:val="22"/>
+              <w:kern w:val="2"/>
+              <w:sz w:val="24"/>
+              <w:szCs w:val="24"/>
+              <w:lang w:val="ru-RU" w:eastAsia="ru-RU"/>
+              <w14:ligatures w14:val="standardContextual"/>
             </w:rPr>
           </w:pPr>
-          <w:hyperlink w:anchor="_Toc200356958" w:history="1">
+          <w:hyperlink w:anchor="_Toc227887516" w:history="1">
             <w:r>
               <w:rPr>
                 <w:rStyle w:val="aa"/>
@@ -13476,7 +12165,7 @@
                 <w:noProof/>
                 <w:webHidden/>
               </w:rPr>
-              <w:instrText xml:space="preserve"> PAGEREF _Toc200356958 \h </w:instrText>
+              <w:instrText xml:space="preserve"> PAGEREF _Toc227887516 \h </w:instrText>
             </w:r>
             <w:r>
               <w:rPr>
@@ -13496,7 +12185,7 @@
                 <w:noProof/>
                 <w:webHidden/>
               </w:rPr>
-              <w:t>64</w:t>
+              <w:t>22</w:t>
             </w:r>
             <w:r>
               <w:rPr>
@@ -13513,10 +12202,14 @@
             <w:rPr>
               <w:rFonts w:asciiTheme="minorHAnsi" w:hAnsiTheme="minorHAnsi" w:cstheme="minorBidi"/>
               <w:noProof/>
-              <w:sz w:val="22"/>
+              <w:kern w:val="2"/>
+              <w:sz w:val="24"/>
+              <w:szCs w:val="24"/>
+              <w:lang w:val="ru-RU" w:eastAsia="ru-RU"/>
+              <w14:ligatures w14:val="standardContextual"/>
             </w:rPr>
           </w:pPr>
-          <w:hyperlink w:anchor="_Toc200356959" w:history="1">
+          <w:hyperlink w:anchor="_Toc227887518" w:history="1">
             <w:r>
               <w:rPr>
                 <w:rStyle w:val="aa"/>
@@ -13543,7 +12236,7 @@
                 <w:noProof/>
                 <w:webHidden/>
               </w:rPr>
-              <w:instrText xml:space="preserve"> PAGEREF _Toc200356959 \h </w:instrText>
+              <w:instrText xml:space="preserve"> PAGEREF _Toc227887518 \h </w:instrText>
             </w:r>
             <w:r>
               <w:rPr>
@@ -13563,7 +12256,7 @@
                 <w:noProof/>
                 <w:webHidden/>
               </w:rPr>
-              <w:t>65</w:t>
+              <w:t>26</w:t>
             </w:r>
             <w:r>
               <w:rPr>
@@ -13580,10 +12273,14 @@
             <w:rPr>
               <w:rFonts w:asciiTheme="minorHAnsi" w:hAnsiTheme="minorHAnsi" w:cstheme="minorBidi"/>
               <w:noProof/>
-              <w:sz w:val="22"/>
+              <w:kern w:val="2"/>
+              <w:sz w:val="24"/>
+              <w:szCs w:val="24"/>
+              <w:lang w:val="ru-RU" w:eastAsia="ru-RU"/>
+              <w14:ligatures w14:val="standardContextual"/>
             </w:rPr>
           </w:pPr>
-          <w:hyperlink w:anchor="_Toc200356960" w:history="1">
+          <w:hyperlink w:anchor="_Toc227887519" w:history="1">
             <w:r>
               <w:rPr>
                 <w:rStyle w:val="aa"/>
@@ -13610,7 +12307,7 @@
                 <w:noProof/>
                 <w:webHidden/>
               </w:rPr>
-              <w:instrText xml:space="preserve"> PAGEREF _Toc200356960 \h </w:instrText>
+              <w:instrText xml:space="preserve"> PAGEREF _Toc227887519 \h </w:instrText>
             </w:r>
             <w:r>
               <w:rPr>
@@ -13630,7 +12327,7 @@
                 <w:noProof/>
                 <w:webHidden/>
               </w:rPr>
-              <w:t>66</w:t>
+              <w:t>28</w:t>
             </w:r>
             <w:r>
               <w:rPr>
@@ -13673,12 +12370,12 @@
         <w:pStyle w:val="HeaderDefault"/>
         <w:spacing w:line="360" w:lineRule="auto"/>
       </w:pPr>
-      <w:bookmarkStart w:id="14" w:name="_Toc200356938"/>
+      <w:bookmarkStart w:id="16" w:name="_Toc227887512"/>
       <w:r>
         <w:lastRenderedPageBreak/>
         <w:t>ВВЕДЕНИЕ</w:t>
       </w:r>
-      <w:bookmarkEnd w:id="14"/>
+      <w:bookmarkEnd w:id="16"/>
     </w:p>
     <w:p>
       <w:pPr>
@@ -14103,8 +12800,9 @@
         <w:spacing w:line="360" w:lineRule="auto"/>
         <w:ind w:left="1134" w:hanging="425"/>
       </w:pPr>
-      <w:bookmarkStart w:id="15" w:name="_Toc161356272"/>
-      <w:bookmarkStart w:id="16" w:name="_Toc221468627"/>
+      <w:bookmarkStart w:id="17" w:name="_Toc161356272"/>
+      <w:bookmarkStart w:id="18" w:name="_Toc221468627"/>
+      <w:bookmarkStart w:id="19" w:name="_Toc227887513"/>
       <w:r>
         <w:lastRenderedPageBreak/>
         <w:t>Системы</w:t>
@@ -14121,8 +12819,9 @@
       <w:r>
         <w:t>авторизации</w:t>
       </w:r>
-      <w:bookmarkEnd w:id="15"/>
-      <w:bookmarkEnd w:id="16"/>
+      <w:bookmarkEnd w:id="17"/>
+      <w:bookmarkEnd w:id="18"/>
+      <w:bookmarkEnd w:id="19"/>
     </w:p>
     <w:p>
       <w:pPr>
@@ -14180,7 +12879,7 @@
           <w:noProof/>
         </w:rPr>
         <w:drawing>
-          <wp:inline distT="0" distB="0" distL="0" distR="0" wp14:anchorId="0483E890" wp14:editId="69F7641E">
+          <wp:inline distT="0" distB="0" distL="0" distR="0" wp14:anchorId="0483E890" wp14:editId="1A2E23F9">
             <wp:extent cx="5783361" cy="2938780"/>
             <wp:effectExtent l="0" t="0" r="8255" b="0"/>
             <wp:docPr id="1975419124" name="Рисунок 1" descr="Picture background"/>
@@ -14261,7 +12960,8 @@
         <w:spacing w:after="0" w:line="360" w:lineRule="auto"/>
         <w:ind w:left="360"/>
       </w:pPr>
-      <w:bookmarkStart w:id="17" w:name="_Toc221468628"/>
+      <w:bookmarkStart w:id="20" w:name="_Toc221468628"/>
+      <w:bookmarkStart w:id="21" w:name="_Toc227887514"/>
       <w:r>
         <w:lastRenderedPageBreak/>
         <w:t xml:space="preserve">Обзор существующих </w:t>
@@ -14275,7 +12975,8 @@
       <w:r>
         <w:t>-решений</w:t>
       </w:r>
-      <w:bookmarkEnd w:id="17"/>
+      <w:bookmarkEnd w:id="20"/>
+      <w:bookmarkEnd w:id="21"/>
     </w:p>
     <w:p>
       <w:pPr>
@@ -14997,8 +13698,8 @@
         <w:t>Для выбора оптимального решения по реализации аутентификации и авторизации в разрабатываемой обучающей платформе был проведён сравнительный анализ различных подходов и существующих SSO-решений. Целью анализа являлось выявление решения, наиболее полно удовлетворяющего требованиям безопасности, масштабируемости, гибкости настройки и экономической целесообразности.</w:t>
       </w:r>
     </w:p>
-    <w:bookmarkStart w:id="18" w:name="_MON_1830799350"/>
-    <w:bookmarkEnd w:id="18"/>
+    <w:bookmarkStart w:id="22" w:name="_MON_1830799350"/>
+    <w:bookmarkEnd w:id="22"/>
     <w:p>
       <w:pPr>
         <w:ind w:firstLine="0"/>
@@ -15030,10 +13731,10 @@
             <v:path o:extrusionok="f" gradientshapeok="t" o:connecttype="rect"/>
             <o:lock v:ext="edit" aspectratio="t"/>
           </v:shapetype>
-          <v:shape id="_x0000_i1025" type="#_x0000_t75" style="width:495pt;height:81.75pt" o:ole="">
+          <v:shape id="_x0000_i1033" type="#_x0000_t75" style="width:495pt;height:81.75pt" o:ole="">
             <v:imagedata r:id="rId21" o:title=""/>
           </v:shape>
-          <o:OLEObject Type="Embed" ProgID="Excel.Sheet.12" ShapeID="_x0000_i1025" DrawAspect="Content" ObjectID="_1838327497" r:id="rId22"/>
+          <o:OLEObject Type="Embed" ProgID="Excel.Sheet.12" ShapeID="_x0000_i1033" DrawAspect="Content" ObjectID="_1838500282" r:id="rId22"/>
         </w:object>
       </w:r>
     </w:p>
@@ -15298,12 +13999,14 @@
         <w:spacing w:line="360" w:lineRule="auto"/>
         <w:ind w:left="2160"/>
       </w:pPr>
-      <w:bookmarkStart w:id="19" w:name="_Toc221468629"/>
+      <w:bookmarkStart w:id="23" w:name="_Toc221468629"/>
+      <w:bookmarkStart w:id="24" w:name="_Toc227887515"/>
       <w:r>
         <w:lastRenderedPageBreak/>
         <w:t>Получившаяся система</w:t>
       </w:r>
-      <w:bookmarkEnd w:id="19"/>
+      <w:bookmarkEnd w:id="23"/>
+      <w:bookmarkEnd w:id="24"/>
     </w:p>
     <w:p>
       <w:pPr>
@@ -15868,12 +14571,14 @@
       <w:pPr>
         <w:pStyle w:val="HeaderDefault"/>
       </w:pPr>
-      <w:bookmarkStart w:id="20" w:name="_Toc221468630"/>
+      <w:bookmarkStart w:id="25" w:name="_Toc221468630"/>
+      <w:bookmarkStart w:id="26" w:name="_Toc227887516"/>
       <w:r>
         <w:lastRenderedPageBreak/>
         <w:t>ЗАКЛЮЧЕНИЕ</w:t>
       </w:r>
-      <w:bookmarkEnd w:id="20"/>
+      <w:bookmarkEnd w:id="25"/>
+      <w:bookmarkEnd w:id="26"/>
     </w:p>
     <w:p>
       <w:pPr>
@@ -16004,12 +14709,12 @@
       <w:pPr>
         <w:pStyle w:val="HeaderDefault"/>
       </w:pPr>
-      <w:bookmarkStart w:id="21" w:name="_Toc200356958"/>
+      <w:bookmarkStart w:id="27" w:name="_Toc227887517"/>
       <w:r>
         <w:lastRenderedPageBreak/>
         <w:t>ЗАКЛЮЧЕНИЕ</w:t>
       </w:r>
-      <w:bookmarkEnd w:id="21"/>
+      <w:bookmarkEnd w:id="27"/>
     </w:p>
     <w:p>
       <w:pPr>
@@ -16144,12 +14849,12 @@
       <w:pPr>
         <w:pStyle w:val="HeaderDefault"/>
       </w:pPr>
-      <w:bookmarkStart w:id="22" w:name="_Toc200356959"/>
+      <w:bookmarkStart w:id="28" w:name="_Toc227887518"/>
       <w:r>
         <w:lastRenderedPageBreak/>
         <w:t>СПИСОК ИСПОЛЬЗОВАННЫХ ИСТОЧНИКОВ</w:t>
       </w:r>
-      <w:bookmarkEnd w:id="22"/>
+      <w:bookmarkEnd w:id="28"/>
     </w:p>
     <w:p>
       <w:pPr>
@@ -16233,16 +14938,7 @@
           <w:szCs w:val="28"/>
           <w:lang w:val="ru-RU"/>
         </w:rPr>
-        <w:t xml:space="preserve"> (дата обращения: 05.10.2025 - 06.02.2026)</w:t>
-      </w:r>
-      <w:r>
-        <w:rPr>
-          <w:rFonts w:eastAsia="Times New Roman" w:cs="Times New Roman"/>
-          <w:color w:val="000000" w:themeColor="text1"/>
-          <w:szCs w:val="28"/>
-          <w:lang w:val="ru-RU"/>
-        </w:rPr>
-        <w:t>.</w:t>
+        <w:t xml:space="preserve"> (дата обращения: 05.10.2025 - 06.02.2026).</w:t>
       </w:r>
     </w:p>
     <w:p>
@@ -16351,15 +15047,7 @@
           <w:color w:val="000000" w:themeColor="text1"/>
           <w:szCs w:val="28"/>
         </w:rPr>
-        <w:t>: 05.10.2025 - 06.02.2026)</w:t>
-      </w:r>
-      <w:r>
-        <w:rPr>
-          <w:rFonts w:eastAsia="Times New Roman" w:cs="Times New Roman"/>
-          <w:color w:val="000000" w:themeColor="text1"/>
-          <w:szCs w:val="28"/>
-        </w:rPr>
-        <w:t>.</w:t>
+        <w:t>: 05.10.2025 - 06.02.2026).</w:t>
       </w:r>
     </w:p>
     <w:p>
@@ -16468,15 +15156,7 @@
           <w:color w:val="000000" w:themeColor="text1"/>
           <w:szCs w:val="28"/>
         </w:rPr>
-        <w:t>: 05.10.2025 - 06.02.2026)</w:t>
-      </w:r>
-      <w:r>
-        <w:rPr>
-          <w:rFonts w:eastAsia="Times New Roman" w:cs="Times New Roman"/>
-          <w:color w:val="000000" w:themeColor="text1"/>
-          <w:szCs w:val="28"/>
-        </w:rPr>
-        <w:t>.</w:t>
+        <w:t>: 05.10.2025 - 06.02.2026).</w:t>
       </w:r>
     </w:p>
     <w:p>
@@ -16724,16 +15404,7 @@
           <w:szCs w:val="28"/>
           <w:lang w:val="ru-RU"/>
         </w:rPr>
-        <w:t xml:space="preserve"> (дата обращения: 05.10.2025 - 06.02.2026)</w:t>
-      </w:r>
-      <w:r>
-        <w:rPr>
-          <w:rFonts w:eastAsia="Times New Roman" w:cs="Times New Roman"/>
-          <w:color w:val="000000" w:themeColor="text1"/>
-          <w:szCs w:val="28"/>
-          <w:lang w:val="ru-RU"/>
-        </w:rPr>
-        <w:t>.</w:t>
+        <w:t xml:space="preserve"> (дата обращения: 05.10.2025 - 06.02.2026).</w:t>
       </w:r>
     </w:p>
     <w:p>
@@ -16983,16 +15654,7 @@
           <w:szCs w:val="28"/>
           <w:lang w:val="ru-RU"/>
         </w:rPr>
-        <w:t xml:space="preserve"> (дата обращения: 05.10.2025 - 06.02.2026)</w:t>
-      </w:r>
-      <w:r>
-        <w:rPr>
-          <w:rFonts w:eastAsia="Times New Roman" w:cs="Times New Roman"/>
-          <w:color w:val="000000" w:themeColor="text1"/>
-          <w:szCs w:val="28"/>
-          <w:lang w:val="ru-RU"/>
-        </w:rPr>
-        <w:t>.</w:t>
+        <w:t xml:space="preserve"> (дата обращения: 05.10.2025 - 06.02.2026).</w:t>
       </w:r>
     </w:p>
     <w:p>
@@ -17065,16 +15727,7 @@
           <w:szCs w:val="28"/>
           <w:lang w:val="ru-RU"/>
         </w:rPr>
-        <w:t xml:space="preserve"> (дата обращения: 05.10.2025 - 06.02.2026)</w:t>
-      </w:r>
-      <w:r>
-        <w:rPr>
-          <w:rFonts w:eastAsia="Times New Roman" w:cs="Times New Roman"/>
-          <w:color w:val="000000" w:themeColor="text1"/>
-          <w:szCs w:val="28"/>
-          <w:lang w:val="ru-RU"/>
-        </w:rPr>
-        <w:t>.</w:t>
+        <w:t xml:space="preserve"> (дата обращения: 05.10.2025 - 06.02.2026).</w:t>
       </w:r>
     </w:p>
     <w:p>
@@ -17147,16 +15800,7 @@
           <w:szCs w:val="28"/>
           <w:lang w:val="ru-RU"/>
         </w:rPr>
-        <w:t xml:space="preserve"> (дата обращения: 05.10.2025 - 06.02.2026)</w:t>
-      </w:r>
-      <w:r>
-        <w:rPr>
-          <w:rFonts w:eastAsia="Times New Roman" w:cs="Times New Roman"/>
-          <w:color w:val="000000" w:themeColor="text1"/>
-          <w:szCs w:val="28"/>
-          <w:lang w:val="ru-RU"/>
-        </w:rPr>
-        <w:t>.</w:t>
+        <w:t xml:space="preserve"> (дата обращения: 05.10.2025 - 06.02.2026).</w:t>
       </w:r>
     </w:p>
     <w:p>
@@ -17221,16 +15865,7 @@
           <w:szCs w:val="28"/>
           <w:lang w:val="ru-RU"/>
         </w:rPr>
-        <w:t xml:space="preserve"> (дата обращения: 05.10.2025 - 06.02.2026)</w:t>
-      </w:r>
-      <w:r>
-        <w:rPr>
-          <w:rFonts w:eastAsia="Times New Roman" w:cs="Times New Roman"/>
-          <w:color w:val="000000" w:themeColor="text1"/>
-          <w:szCs w:val="28"/>
-          <w:lang w:val="ru-RU"/>
-        </w:rPr>
-        <w:t>.</w:t>
+        <w:t xml:space="preserve"> (дата обращения: 05.10.2025 - 06.02.2026).</w:t>
       </w:r>
     </w:p>
     <w:p>
@@ -17295,16 +15930,7 @@
           <w:szCs w:val="28"/>
           <w:lang w:val="ru-RU"/>
         </w:rPr>
-        <w:t xml:space="preserve"> (дата обращения: 05.10.2025 - 06.02.2026)</w:t>
-      </w:r>
-      <w:r>
-        <w:rPr>
-          <w:rFonts w:eastAsia="Times New Roman" w:cs="Times New Roman"/>
-          <w:color w:val="000000" w:themeColor="text1"/>
-          <w:szCs w:val="28"/>
-          <w:lang w:val="ru-RU"/>
-        </w:rPr>
-        <w:t>.</w:t>
+        <w:t xml:space="preserve"> (дата обращения: 05.10.2025 - 06.02.2026).</w:t>
       </w:r>
     </w:p>
     <w:p>
@@ -17413,15 +16039,7 @@
           <w:color w:val="000000" w:themeColor="text1"/>
           <w:szCs w:val="28"/>
         </w:rPr>
-        <w:t>: 05.10.2025 - 06.02.2026)</w:t>
-      </w:r>
-      <w:r>
-        <w:rPr>
-          <w:rFonts w:eastAsia="Times New Roman" w:cs="Times New Roman"/>
-          <w:color w:val="000000" w:themeColor="text1"/>
-          <w:szCs w:val="28"/>
-        </w:rPr>
-        <w:t>.</w:t>
+        <w:t>: 05.10.2025 - 06.02.2026).</w:t>
       </w:r>
     </w:p>
     <w:p>
@@ -17530,15 +16148,7 @@
           <w:color w:val="000000" w:themeColor="text1"/>
           <w:szCs w:val="28"/>
         </w:rPr>
-        <w:t>: 05.10.2025 - 06.02.2026)</w:t>
-      </w:r>
-      <w:r>
-        <w:rPr>
-          <w:rFonts w:eastAsia="Times New Roman" w:cs="Times New Roman"/>
-          <w:color w:val="000000" w:themeColor="text1"/>
-          <w:szCs w:val="28"/>
-        </w:rPr>
-        <w:t>.</w:t>
+        <w:t>: 05.10.2025 - 06.02.2026).</w:t>
       </w:r>
     </w:p>
     <w:p>
@@ -17647,15 +16257,7 @@
           <w:color w:val="000000" w:themeColor="text1"/>
           <w:szCs w:val="28"/>
         </w:rPr>
-        <w:t>: 05.10.2025 - 06.02.2026)</w:t>
-      </w:r>
-      <w:r>
-        <w:rPr>
-          <w:rFonts w:eastAsia="Times New Roman" w:cs="Times New Roman"/>
-          <w:color w:val="000000" w:themeColor="text1"/>
-          <w:szCs w:val="28"/>
-        </w:rPr>
-        <w:t>.</w:t>
+        <w:t>: 05.10.2025 - 06.02.2026).</w:t>
       </w:r>
     </w:p>
     <w:p>
@@ -17764,15 +16366,7 @@
           <w:color w:val="000000" w:themeColor="text1"/>
           <w:szCs w:val="28"/>
         </w:rPr>
-        <w:t>: 05.10.2025 - 06.02.2026)</w:t>
-      </w:r>
-      <w:r>
-        <w:rPr>
-          <w:rFonts w:eastAsia="Times New Roman" w:cs="Times New Roman"/>
-          <w:color w:val="000000" w:themeColor="text1"/>
-          <w:szCs w:val="28"/>
-        </w:rPr>
-        <w:t>.</w:t>
+        <w:t>: 05.10.2025 - 06.02.2026).</w:t>
       </w:r>
     </w:p>
     <w:p>
@@ -17881,15 +16475,7 @@
           <w:color w:val="000000" w:themeColor="text1"/>
           <w:szCs w:val="28"/>
         </w:rPr>
-        <w:t>: 05.10.2025 - 06.02.2026)</w:t>
-      </w:r>
-      <w:r>
-        <w:rPr>
-          <w:rFonts w:eastAsia="Times New Roman" w:cs="Times New Roman"/>
-          <w:color w:val="000000" w:themeColor="text1"/>
-          <w:szCs w:val="28"/>
-        </w:rPr>
-        <w:t>.</w:t>
+        <w:t>: 05.10.2025 - 06.02.2026).</w:t>
       </w:r>
     </w:p>
     <w:p>
@@ -17974,16 +16560,7 @@
           <w:szCs w:val="28"/>
           <w:lang w:val="ru-RU"/>
         </w:rPr>
-        <w:t xml:space="preserve"> (дата обращения: 05.10.2025 - 06.02.2026)</w:t>
-      </w:r>
-      <w:r>
-        <w:rPr>
-          <w:rFonts w:eastAsia="Times New Roman" w:cs="Times New Roman"/>
-          <w:color w:val="000000" w:themeColor="text1"/>
-          <w:szCs w:val="28"/>
-          <w:lang w:val="ru-RU"/>
-        </w:rPr>
-        <w:t>.</w:t>
+        <w:t xml:space="preserve"> (дата обращения: 05.10.2025 - 06.02.2026).</w:t>
       </w:r>
     </w:p>
     <w:p>
@@ -18059,16 +16636,7 @@
           <w:szCs w:val="28"/>
           <w:lang w:val="ru-RU"/>
         </w:rPr>
-        <w:t xml:space="preserve"> (дата обращения: 05.10.2025 - 06.02.2026)</w:t>
-      </w:r>
-      <w:r>
-        <w:rPr>
-          <w:rFonts w:eastAsia="Times New Roman" w:cs="Times New Roman"/>
-          <w:color w:val="000000" w:themeColor="text1"/>
-          <w:szCs w:val="28"/>
-          <w:lang w:val="ru-RU"/>
-        </w:rPr>
-        <w:t>.</w:t>
+        <w:t xml:space="preserve"> (дата обращения: 05.10.2025 - 06.02.2026).</w:t>
       </w:r>
     </w:p>
     <w:p>
@@ -18133,16 +16701,7 @@
           <w:szCs w:val="28"/>
           <w:lang w:val="ru-RU"/>
         </w:rPr>
-        <w:t xml:space="preserve"> (дата обращения: 05.10.2025 - 06.02.2026)</w:t>
-      </w:r>
-      <w:r>
-        <w:rPr>
-          <w:rFonts w:eastAsia="Times New Roman" w:cs="Times New Roman"/>
-          <w:color w:val="000000" w:themeColor="text1"/>
-          <w:szCs w:val="28"/>
-          <w:lang w:val="ru-RU"/>
-        </w:rPr>
-        <w:t>.</w:t>
+        <w:t xml:space="preserve"> (дата обращения: 05.10.2025 - 06.02.2026).</w:t>
       </w:r>
     </w:p>
     <w:p>
@@ -18207,16 +16766,7 @@
           <w:szCs w:val="28"/>
           <w:lang w:val="ru-RU"/>
         </w:rPr>
-        <w:t xml:space="preserve"> (дата обращения: 05.10.2025 - 06.02.2026)</w:t>
-      </w:r>
-      <w:r>
-        <w:rPr>
-          <w:rFonts w:eastAsia="Times New Roman" w:cs="Times New Roman"/>
-          <w:color w:val="000000" w:themeColor="text1"/>
-          <w:szCs w:val="28"/>
-          <w:lang w:val="ru-RU"/>
-        </w:rPr>
-        <w:t>.</w:t>
+        <w:t xml:space="preserve"> (дата обращения: 05.10.2025 - 06.02.2026).</w:t>
       </w:r>
     </w:p>
     <w:p>
@@ -18325,15 +16875,7 @@
           <w:color w:val="000000" w:themeColor="text1"/>
           <w:szCs w:val="28"/>
         </w:rPr>
-        <w:t>: 05.10.2025 - 06.02.2026)</w:t>
-      </w:r>
-      <w:r>
-        <w:rPr>
-          <w:rFonts w:eastAsia="Times New Roman" w:cs="Times New Roman"/>
-          <w:color w:val="000000" w:themeColor="text1"/>
-          <w:szCs w:val="28"/>
-        </w:rPr>
-        <w:t>.</w:t>
+        <w:t>: 05.10.2025 - 06.02.2026).</w:t>
       </w:r>
     </w:p>
     <w:p>
@@ -18398,16 +16940,7 @@
           <w:szCs w:val="28"/>
           <w:lang w:val="ru-RU"/>
         </w:rPr>
-        <w:t xml:space="preserve"> (дата обращения: 05.10.2025 - 06.02.2026)</w:t>
-      </w:r>
-      <w:r>
-        <w:rPr>
-          <w:rFonts w:eastAsia="Times New Roman" w:cs="Times New Roman"/>
-          <w:color w:val="000000" w:themeColor="text1"/>
-          <w:szCs w:val="28"/>
-          <w:lang w:val="ru-RU"/>
-        </w:rPr>
-        <w:t>.</w:t>
+        <w:t xml:space="preserve"> (дата обращения: 05.10.2025 - 06.02.2026).</w:t>
       </w:r>
     </w:p>
     <w:p>
@@ -18433,7 +16966,7 @@
       <w:pPr>
         <w:pStyle w:val="HeaderDefault"/>
       </w:pPr>
-      <w:bookmarkStart w:id="23" w:name="_Toc200356960"/>
+      <w:bookmarkStart w:id="29" w:name="_Toc227887519"/>
       <w:r>
         <w:lastRenderedPageBreak/>
         <w:t xml:space="preserve">ПРИЛОЖЕНИЕ А. </w:t>
@@ -18441,7 +16974,7 @@
       <w:r>
         <w:t>Графическая часть выпускной квалификационной работы</w:t>
       </w:r>
-      <w:bookmarkEnd w:id="23"/>
+      <w:bookmarkEnd w:id="29"/>
     </w:p>
     <w:p>
       <w:pPr>
@@ -18571,7 +17104,7 @@
         </w:numPr>
       </w:pPr>
       <w:r>
-        <w:t>Система геопривязки</w:t>
+        <w:t>Реализация авторизации</w:t>
       </w:r>
       <w:r>
         <w:rPr>
@@ -18589,7 +17122,7 @@
         </w:numPr>
       </w:pPr>
       <w:r>
-        <w:t>AR-функционал</w:t>
+        <w:t>Структура урока</w:t>
       </w:r>
       <w:r>
         <w:rPr>
@@ -18607,7 +17140,7 @@
         </w:numPr>
       </w:pPr>
       <w:r>
-        <w:t>Матрица проекций</w:t>
+        <w:t>Представление формул</w:t>
       </w:r>
       <w:r>
         <w:rPr>
@@ -18625,7 +17158,7 @@
         </w:numPr>
       </w:pPr>
       <w:r>
-        <w:t>GPT-ассистент</w:t>
+        <w:t>Ролевая модель</w:t>
       </w:r>
       <w:r>
         <w:rPr>
@@ -18643,7 +17176,7 @@
         </w:numPr>
       </w:pPr>
       <w:r>
-        <w:t>Организация системы контекста запросов в GPT</w:t>
+        <w:t>Видеоплеер</w:t>
       </w:r>
       <w:r>
         <w:t>;</w:t>
@@ -18658,7 +17191,7 @@
         </w:numPr>
       </w:pPr>
       <w:r>
-        <w:t>Генерация ответа</w:t>
+        <w:t>Кодеки</w:t>
       </w:r>
       <w:r>
         <w:rPr>
@@ -18676,7 +17209,7 @@
         </w:numPr>
       </w:pPr>
       <w:r>
-        <w:t>Организация системы подписки</w:t>
+        <w:t>Демонстрация работы</w:t>
       </w:r>
       <w:r>
         <w:rPr>
@@ -24154,6 +22687,7 @@
   <w:style w:type="character" w:default="1" w:styleId="a0">
     <w:name w:val="Default Paragraph Font"/>
     <w:uiPriority w:val="1"/>
+    <w:semiHidden/>
     <w:unhideWhenUsed/>
   </w:style>
   <w:style w:type="table" w:default="1" w:styleId="a1">
@@ -25390,6 +23924,7 @@
     <w:rsid w:val="001C3F3A"/>
     <w:rsid w:val="00207311"/>
     <w:rsid w:val="00250605"/>
+    <w:rsid w:val="004864AF"/>
     <w:rsid w:val="00524E3C"/>
     <w:rsid w:val="00620703"/>
     <w:rsid w:val="006453E6"/>
@@ -25397,6 +23932,7 @@
     <w:rsid w:val="006B2E45"/>
     <w:rsid w:val="007E0FD2"/>
     <w:rsid w:val="00884D6D"/>
+    <w:rsid w:val="00A13321"/>
     <w:rsid w:val="00B22411"/>
     <w:rsid w:val="00BF7F0C"/>
     <w:rsid w:val="00C22CFC"/>

</xml_diff>